<commit_message>
docs(grant): complete team introduction with real details
Fills every placeholder in the GASOK question-3 document: contact, location,
availability, education, employment, first-hire reasoning.

The onchain paragraph states plainly that GiwaCard is the first protocol shipped
end to end rather than implying a longer track record. Everything claimed here
is checkable from the links in the final table, which is the only reason the
claim is worth making.

Co-Authored-By: Claude Opus 5 <noreply@anthropic.com>
</commit_message>
<xml_diff>
--- a/docs/grant/GiwaCard-Team-Introduction.docx
+++ b/docs/grant/GiwaCard-Team-Introduction.docx
@@ -169,10 +169,7 @@
           </w:tcPr>
           <w:p>
             <w:r>
-              <w:rPr>
-                <w:color w:val="B42C2C"/>
-              </w:rPr>
-              <w:t>[FILL: city]</w:t>
+              <w:t>Yogyakarta, Indonesia</w:t>
             </w:r>
           </w:p>
         </w:tc>
@@ -222,10 +219,7 @@
           </w:tcPr>
           <w:p>
             <w:r>
-              <w:rPr>
-                <w:color w:val="B42C2C"/>
-              </w:rPr>
-              <w:t>[FILL: contact email]</w:t>
+              <w:t>axelmatsama@gmail.com</w:t>
             </w:r>
           </w:p>
         </w:tc>
@@ -250,10 +244,7 @@
           </w:tcPr>
           <w:p>
             <w:r>
-              <w:rPr>
-                <w:color w:val="B42C2C"/>
-              </w:rPr>
-              <w:t>[FILL: handle, if you want one listed]</w:t>
+              <w:t>X: @lexirieru  ·  Telegram: @lexirieru</w:t>
             </w:r>
           </w:p>
         </w:tc>
@@ -278,10 +269,7 @@
           </w:tcPr>
           <w:p>
             <w:r>
-              <w:rPr>
-                <w:color w:val="B42C2C"/>
-              </w:rPr>
-              <w:t>[FILL: full-time or part-time, hours per week]</w:t>
+              <w:t>Full-time on GiwaCard through the programme</w:t>
             </w:r>
           </w:p>
         </w:tc>
@@ -487,28 +475,43 @@
     <w:p>
       <w:r>
         <w:rPr>
+          <w:b/>
+        </w:rPr>
+        <w:t>Second-year Information Engineering student at Universitas Gadjah Mada</w:t>
+      </w:r>
+      <w:r>
+        <w:rPr>
           <w:b w:val="0"/>
-          <w:color w:val="B42C2C"/>
         </w:rPr>
-        <w:t>[FILL: education — university, programme, year]</w:t>
+        <w:t xml:space="preserve"> in Yogyakarta, consistently ranked among Indonesia’s three leading universities.</w:t>
       </w:r>
     </w:p>
     <w:p>
       <w:r>
         <w:rPr>
+          <w:b/>
+        </w:rPr>
+        <w:t>AI Engineer at IDN Financials</w:t>
+      </w:r>
+      <w:r>
+        <w:rPr>
           <w:b w:val="0"/>
-          <w:color w:val="B42C2C"/>
         </w:rPr>
-        <w:t>[FILL: prior work or projects worth naming — shipped products, hackathons, open source, employment. Two or three lines is enough; link anything public.]</w:t>
+        <w:t>, an Indonesian stock-market news publication, where I work on the AI systems behind its coverage. That job is the reason the engineering here looks the way it does: shipping systems other people depend on daily is a different discipline from shipping a demo, and it is where the habits in this codebase came from — tests that assert the thing you are afraid of, documentation aimed at whoever arrives next, and the willingness to reverse a design when the code proves it wrong.</w:t>
       </w:r>
     </w:p>
     <w:p>
       <w:r>
         <w:rPr>
+          <w:b/>
+        </w:rPr>
+        <w:t xml:space="preserve">Onchain. </w:t>
+      </w:r>
+      <w:r>
+        <w:rPr>
           <w:b w:val="0"/>
-          <w:color w:val="B42C2C"/>
         </w:rPr>
-        <w:t>[FILL: any prior onchain work — protocols, audits, testnet deployments.]</w:t>
+        <w:t>GiwaCard is the first protocol I have designed and shipped end to end on my own — the contracts, their deployment and verification, the tooling, the services, and the four live surfaces. I am early in my onchain career and I would rather say so than dress it up, because everything I am claiming in this application is already onchain and readable, and a reviewer who checks it will find exactly what is described. Deployed, source-verified, upgradeable contracts with an upgrade test that asserts storage survives is not the work of someone learning Solidity during the application.</w:t>
       </w:r>
     </w:p>
     <w:p>
@@ -535,35 +538,9 @@
     <w:p>
       <w:r>
         <w:rPr>
-          <w:b w:val="0"/>
+          <w:i w:val="0"/>
         </w:rPr>
-        <w:t xml:space="preserve">If the programme's support makes it sensible to grow the team, the first hire would be </w:t>
-      </w:r>
-      <w:r>
-        <w:rPr>
-          <w:b w:val="0"/>
-          <w:color w:val="B42C2C"/>
-        </w:rPr>
-        <w:t>[FILL: e.g. a frontend engineer, or a developer-relations person]</w:t>
-      </w:r>
-      <w:r>
-        <w:rPr>
-          <w:b w:val="0"/>
-        </w:rPr>
-        <w:t xml:space="preserve">, because </w:t>
-      </w:r>
-      <w:r>
-        <w:rPr>
-          <w:b w:val="0"/>
-          <w:color w:val="B42C2C"/>
-        </w:rPr>
-        <w:t>[FILL: one sentence on the bottleneck that hire removes]</w:t>
-      </w:r>
-      <w:r>
-        <w:rPr>
-          <w:b w:val="0"/>
-        </w:rPr>
-        <w:t>.</w:t>
+        <w:t>If the programme’s support makes it sensible to grow the team, the first hire would be someone working on merchant integration and developer relations, not a second protocol engineer. The bottleneck ahead of GiwaCard is not building — the contracts and the tooling already exist and I can extend them — it is that a payment rail is worth nothing until there are places to spend it, and getting merchants and agent developers to adopt an SDK is a different job from writing one, done in parallel rather than after.</w:t>
       </w:r>
     </w:p>
     <w:p>
@@ -777,7 +754,7 @@
           <w:color w:val="6B6B72"/>
           <w:sz w:val="19"/>
         </w:rPr>
-        <w:t>Before submitting: replace every red [FILL: …] placeholder, then export to PDF or share with “Anyone with the link can view”.</w:t>
+        <w:t>Export to PDF or share with “Anyone with the link can view”, then paste the link into question 3 of the GASOK form.</w:t>
       </w:r>
     </w:p>
     <w:sectPr>

</xml_diff>